<commit_message>
Settle the screenshots and the Impact table
Screenshots: the Claude Desktop frames ship as reconstructions. Standing
up a live connector needs an Agiloft licence we do not hold, so the
surrounding UI is drawn rather than captured. Both the README and
SCREENSHOTS-NEEDED now give that reason instead of describing the images
as pending, which implied they were waiting on us.

Impact table: replaced the two TBD rows with one measured row - building
the four-tab dashboard takes 15-20 minutes from a single question. The
"before" column deliberately carries no number: Agiloft has no view that
answers all four questions side by side, so there is nothing to time
against, and inventing a baseline would undermine the measured accuracy
figures in the same section.

Dropped the interruptions-per-week row entirely.

Co-Authored-By: Claude Opus 5 (1M context) <noreply@anthropic.com>
Claude-Session: https://claude.ai/code/session_01SXQ8rJ6xUz42hT2QQGccbc
</commit_message>
<xml_diff>
--- a/blog/Solving Contract Lookup Bottlenecks Using a Claude Skill.docx
+++ b/blog/Solving Contract Lookup Bottlenecks Using a Claude Skill.docx
@@ -892,15 +892,14 @@
         <w:tblLook w:firstColumn="1" w:firstRow="1" w:lastColumn="0" w:lastRow="0" w:noHBand="0" w:noVBand="1" w:val="04A0"/>
       </w:tblPr>
       <w:tblGrid>
-        <w:gridCol w:w="2160"/>
-        <w:gridCol w:w="2160"/>
-        <w:gridCol w:w="2160"/>
-        <w:gridCol w:w="2160"/>
+        <w:gridCol w:w="2880"/>
+        <w:gridCol w:w="2880"/>
+        <w:gridCol w:w="2880"/>
       </w:tblGrid>
       <w:tr>
         <w:tc>
           <w:tcPr>
-            <w:tcW w:type="dxa" w:w="2160"/>
+            <w:tcW w:type="dxa" w:w="2880"/>
           </w:tcPr>
           <w:p>
             <w:r/>
@@ -915,7 +914,7 @@
         </w:tc>
         <w:tc>
           <w:tcPr>
-            <w:tcW w:type="dxa" w:w="2160"/>
+            <w:tcW w:type="dxa" w:w="2880"/>
           </w:tcPr>
           <w:p>
             <w:r/>
@@ -930,7 +929,7 @@
         </w:tc>
         <w:tc>
           <w:tcPr>
-            <w:tcW w:type="dxa" w:w="2160"/>
+            <w:tcW w:type="dxa" w:w="2880"/>
           </w:tcPr>
           <w:p>
             <w:r/>
@@ -943,9 +942,41 @@
             </w:r>
           </w:p>
         </w:tc>
+      </w:tr>
+      <w:tr>
         <w:tc>
           <w:tcPr>
-            <w:tcW w:type="dxa" w:w="2160"/>
+            <w:tcW w:type="dxa" w:w="2880"/>
+          </w:tcPr>
+          <w:p>
+            <w:r/>
+            <w:r>
+              <w:rPr>
+                <w:b w:val="0"/>
+                <w:i w:val="0"/>
+              </w:rPr>
+              <w:t>Building the four-tab dashboard</w:t>
+            </w:r>
+          </w:p>
+        </w:tc>
+        <w:tc>
+          <w:tcPr>
+            <w:tcW w:type="dxa" w:w="2880"/>
+          </w:tcPr>
+          <w:p>
+            <w:r/>
+            <w:r>
+              <w:rPr>
+                <w:b w:val="0"/>
+                <w:i w:val="0"/>
+              </w:rPr>
+              <w:t>Assembled by hand in Agiloft, one report at a time, by someone who knows the reporting module</w:t>
+            </w:r>
+          </w:p>
+        </w:tc>
+        <w:tc>
+          <w:tcPr>
+            <w:tcW w:type="dxa" w:w="2880"/>
           </w:tcPr>
           <w:p>
             <w:r/>
@@ -954,131 +985,14 @@
                 <w:b/>
                 <w:i w:val="0"/>
               </w:rPr>
-              <w:t>Improvement</w:t>
+              <w:t>15–20 minutes</w:t>
             </w:r>
-          </w:p>
-        </w:tc>
-      </w:tr>
-      <w:tr>
-        <w:tc>
-          <w:tcPr>
-            <w:tcW w:type="dxa" w:w="2160"/>
-          </w:tcPr>
-          <w:p>
-            <w:r/>
             <w:r>
               <w:rPr>
                 <w:b w:val="0"/>
                 <w:i w:val="0"/>
               </w:rPr>
-              <w:t>Time to answer a routine contract question</w:t>
-            </w:r>
-          </w:p>
-        </w:tc>
-        <w:tc>
-          <w:tcPr>
-            <w:tcW w:type="dxa" w:w="2160"/>
-          </w:tcPr>
-          <w:p>
-            <w:r/>
-            <w:r>
-              <w:rPr>
-                <w:b w:val="0"/>
-                <w:i/>
-              </w:rPr>
-              <w:t>TBD</w:t>
-            </w:r>
-          </w:p>
-        </w:tc>
-        <w:tc>
-          <w:tcPr>
-            <w:tcW w:type="dxa" w:w="2160"/>
-          </w:tcPr>
-          <w:p>
-            <w:r/>
-            <w:r>
-              <w:rPr>
-                <w:b w:val="0"/>
-                <w:i/>
-              </w:rPr>
-              <w:t>TBD</w:t>
-            </w:r>
-          </w:p>
-        </w:tc>
-        <w:tc>
-          <w:tcPr>
-            <w:tcW w:type="dxa" w:w="2160"/>
-          </w:tcPr>
-          <w:p>
-            <w:r/>
-            <w:r>
-              <w:rPr>
-                <w:b w:val="0"/>
-                <w:i/>
-              </w:rPr>
-              <w:t>TBD</w:t>
-            </w:r>
-          </w:p>
-        </w:tc>
-      </w:tr>
-      <w:tr>
-        <w:tc>
-          <w:tcPr>
-            <w:tcW w:type="dxa" w:w="2160"/>
-          </w:tcPr>
-          <w:p>
-            <w:r/>
-            <w:r>
-              <w:rPr>
-                <w:b w:val="0"/>
-                <w:i w:val="0"/>
-              </w:rPr>
-              <w:t>Paralegal interruptions per week</w:t>
-            </w:r>
-          </w:p>
-        </w:tc>
-        <w:tc>
-          <w:tcPr>
-            <w:tcW w:type="dxa" w:w="2160"/>
-          </w:tcPr>
-          <w:p>
-            <w:r/>
-            <w:r>
-              <w:rPr>
-                <w:b w:val="0"/>
-                <w:i/>
-              </w:rPr>
-              <w:t>TBD</w:t>
-            </w:r>
-          </w:p>
-        </w:tc>
-        <w:tc>
-          <w:tcPr>
-            <w:tcW w:type="dxa" w:w="2160"/>
-          </w:tcPr>
-          <w:p>
-            <w:r/>
-            <w:r>
-              <w:rPr>
-                <w:b w:val="0"/>
-                <w:i/>
-              </w:rPr>
-              <w:t>TBD</w:t>
-            </w:r>
-          </w:p>
-        </w:tc>
-        <w:tc>
-          <w:tcPr>
-            <w:tcW w:type="dxa" w:w="2160"/>
-          </w:tcPr>
-          <w:p>
-            <w:r/>
-            <w:r>
-              <w:rPr>
-                <w:b w:val="0"/>
-                <w:i/>
-              </w:rPr>
-              <w:t>TBD</w:t>
+              <w:t>, from a single question, by someone who has never opened Agiloft</w:t>
             </w:r>
           </w:p>
         </w:tc>
@@ -1089,9 +1003,27 @@
       <w:r>
         <w:rPr>
           <w:b w:val="0"/>
-          <w:i/>
+          <w:i w:val="0"/>
         </w:rPr>
-        <w:t>[To be measured during the live pilot. We have deliberately not estimated these - the accuracy numbers below are measured, and mixing them with guesses would undermine both.]</w:t>
+        <w:t>The "before" column has no number in it on purpose. There is no Agiloft view that</w:t>
+      </w:r>
+    </w:p>
+    <w:p>
+      <w:r>
+        <w:rPr>
+          <w:b w:val="0"/>
+          <w:i w:val="0"/>
+        </w:rPr>
+        <w:t>answers all four of these questions side by side, so there is nothing to time -</w:t>
+      </w:r>
+    </w:p>
+    <w:p>
+      <w:r>
+        <w:rPr>
+          <w:b w:val="0"/>
+          <w:i w:val="0"/>
+        </w:rPr>
+        <w:t>the comparison is between a dashboard that gets built and one that does not.</w:t>
       </w:r>
     </w:p>
     <w:p>

</xml_diff>